<commit_message>
CS1103 Unit 7 assignment: full Javadoc (doclint clean), message-flow walkthrough, small cleanups
Co-Authored-By: Claude Opus 5.5 <noreply@anthropic.com>
</commit_message>
<xml_diff>
--- a/CS1103_Programming_2/Unit7_Files_Networking/Assignment/Unit7_Programming_Assignment.docx
+++ b/CS1103_Programming_2/Unit7_Files_Networking/Assignment/Unit7_Programming_Assignment.docx
@@ -711,6 +711,124 @@
           <w:sz w:val="24"/>
         </w:rPr>
         <w:t>Because the listener runs on its own, messages from other users appear immediately, even while this user is in the middle of typing. When the user types /quit, the client sends it, waits for the server's goodbye, and exits. If the server goes away, the listener reports that the server closed the connection. If no server is running at all, the client prints a clear message instead of a stack trace.</w:t>
+      </w:r>
+    </w:p>
+    <w:p>
+      <w:pPr>
+        <w:pStyle w:val="Heading2"/>
+        <w:jc w:val="left"/>
+      </w:pPr>
+      <w:r>
+        <w:rPr>
+          <w:rFonts w:ascii="Times New Roman" w:hAnsi="Times New Roman"/>
+          <w:b/>
+          <w:color w:val="000000"/>
+          <w:sz w:val="24"/>
+        </w:rPr>
+        <w:t>How One Message Travels</w:t>
+      </w:r>
+    </w:p>
+    <w:p>
+      <w:pPr>
+        <w:spacing w:line="360" w:lineRule="auto" w:after="200"/>
+      </w:pPr>
+      <w:r>
+        <w:rPr>
+          <w:rFonts w:ascii="Times New Roman" w:hAnsi="Times New Roman"/>
+          <w:b w:val="0"/>
+          <w:i w:val="0"/>
+          <w:sz w:val="24"/>
+        </w:rPr>
+        <w:t>The steps below follow a single message from Alice's keyboard to every screen, naming the method that does each step.</w:t>
+      </w:r>
+    </w:p>
+    <w:p>
+      <w:pPr>
+        <w:spacing w:line="360" w:lineRule="auto" w:after="0"/>
+        <w:ind w:left="720" w:hanging="360"/>
+      </w:pPr>
+      <w:r>
+        <w:rPr>
+          <w:rFonts w:ascii="Times New Roman" w:hAnsi="Times New Roman"/>
+          <w:b w:val="0"/>
+          <w:i w:val="0"/>
+          <w:sz w:val="24"/>
+        </w:rPr>
+        <w:t>1. Alice types "Hello" and presses Enter. The main thread of her ChatClient reads the line from the keyboard and writes it to the socket with toServer.println().</w:t>
+      </w:r>
+    </w:p>
+    <w:p>
+      <w:pPr>
+        <w:spacing w:line="360" w:lineRule="auto" w:after="0"/>
+        <w:ind w:left="720" w:hanging="360"/>
+      </w:pPr>
+      <w:r>
+        <w:rPr>
+          <w:rFonts w:ascii="Times New Roman" w:hAnsi="Times New Roman"/>
+          <w:b w:val="0"/>
+          <w:i w:val="0"/>
+          <w:sz w:val="24"/>
+        </w:rPr>
+        <w:t>2. On the server, Alice's ClientHandler thread is waiting in in.readLine(). It receives "Hello" and passes it to handleLine(), which sees that it is not a command.</w:t>
+      </w:r>
+    </w:p>
+    <w:p>
+      <w:pPr>
+        <w:spacing w:line="360" w:lineRule="auto" w:after="0"/>
+        <w:ind w:left="720" w:hanging="360"/>
+      </w:pPr>
+      <w:r>
+        <w:rPr>
+          <w:rFonts w:ascii="Times New Roman" w:hAnsi="Times New Roman"/>
+          <w:b w:val="0"/>
+          <w:i w:val="0"/>
+          <w:sz w:val="24"/>
+        </w:rPr>
+        <w:t>3. handleLine() calls server.broadcast() with the text "[10:01:30] Alice#1: Hello".</w:t>
+      </w:r>
+    </w:p>
+    <w:p>
+      <w:pPr>
+        <w:spacing w:line="360" w:lineRule="auto" w:after="0"/>
+        <w:ind w:left="720" w:hanging="360"/>
+      </w:pPr>
+      <w:r>
+        <w:rPr>
+          <w:rFonts w:ascii="Times New Roman" w:hAnsi="Times New Roman"/>
+          <w:b w:val="0"/>
+          <w:i w:val="0"/>
+          <w:sz w:val="24"/>
+        </w:rPr>
+        <w:t>4. broadcast() loops over every ClientHandler in connectedUsers and calls send() on each, which writes the line to that user's socket.</w:t>
+      </w:r>
+    </w:p>
+    <w:p>
+      <w:pPr>
+        <w:spacing w:line="360" w:lineRule="auto" w:after="0"/>
+        <w:ind w:left="720" w:hanging="360"/>
+      </w:pPr>
+      <w:r>
+        <w:rPr>
+          <w:rFonts w:ascii="Times New Roman" w:hAnsi="Times New Roman"/>
+          <w:b w:val="0"/>
+          <w:i w:val="0"/>
+          <w:sz w:val="24"/>
+        </w:rPr>
+        <w:t>5. In every client, including Alice's, the listener thread is waiting in fromServer.readLine(). It receives the line and prints it on the screen.</w:t>
+      </w:r>
+    </w:p>
+    <w:p>
+      <w:pPr>
+        <w:spacing w:line="360" w:lineRule="auto" w:after="200"/>
+      </w:pPr>
+      <w:r>
+        <w:rPr>
+          <w:rFonts w:ascii="Times New Roman" w:hAnsi="Times New Roman"/>
+          <w:b w:val="0"/>
+          <w:i w:val="0"/>
+          <w:sz w:val="24"/>
+        </w:rPr>
+        <w:t>Because the server reads from each client on that client's own thread, Bob can be sending a message at the same moment, and both messages are delivered.</w:t>
       </w:r>
     </w:p>
     <w:p>
@@ -1805,7 +1923,7 @@
                 <w:b w:val="0"/>
                 <w:sz w:val="21"/>
               </w:rPr>
-              <w:t>Javadoc on every class and method</w:t>
+              <w:t>Javadoc on every class, method, and field; javac -Xdoclint:all reports zero warnings</w:t>
             </w:r>
           </w:p>
         </w:tc>
@@ -2491,6 +2609,19 @@
           <w:rFonts w:ascii="Courier New" w:hAnsi="Courier New"/>
           <w:sz w:val="19"/>
         </w:rPr>
+        <w:t>import java.util.Comparator;</w:t>
+      </w:r>
+    </w:p>
+    <w:p>
+      <w:pPr>
+        <w:spacing w:line="240" w:lineRule="auto" w:after="0"/>
+        <w:ind w:left="432"/>
+      </w:pPr>
+      <w:r>
+        <w:rPr>
+          <w:rFonts w:ascii="Courier New" w:hAnsi="Courier New"/>
+          <w:sz w:val="19"/>
+        </w:rPr>
         <w:t>import java.util.List;</w:t>
       </w:r>
     </w:p>
@@ -2751,6 +2882,19 @@
           <w:rFonts w:ascii="Courier New" w:hAnsi="Courier New"/>
           <w:sz w:val="19"/>
         </w:rPr>
+        <w:t xml:space="preserve">    /** Format of the time stamps in chat messages and log lines. */</w:t>
+      </w:r>
+    </w:p>
+    <w:p>
+      <w:pPr>
+        <w:spacing w:line="240" w:lineRule="auto" w:after="0"/>
+        <w:ind w:left="432"/>
+      </w:pPr>
+      <w:r>
+        <w:rPr>
+          <w:rFonts w:ascii="Courier New" w:hAnsi="Courier New"/>
+          <w:sz w:val="19"/>
+        </w:rPr>
         <w:t xml:space="preserve">    private static final DateTimeFormatter CLOCK = DateTimeFormatter.ofPattern("HH:mm:ss");</w:t>
       </w:r>
     </w:p>
@@ -2777,6 +2921,19 @@
           <w:rFonts w:ascii="Courier New" w:hAnsi="Courier New"/>
           <w:sz w:val="19"/>
         </w:rPr>
+        <w:t xml:space="preserve">    /** Port to listen on; 0 lets the operating system choose a free one. */</w:t>
+      </w:r>
+    </w:p>
+    <w:p>
+      <w:pPr>
+        <w:spacing w:line="240" w:lineRule="auto" w:after="0"/>
+        <w:ind w:left="432"/>
+      </w:pPr>
+      <w:r>
+        <w:rPr>
+          <w:rFonts w:ascii="Courier New" w:hAnsi="Courier New"/>
+          <w:sz w:val="19"/>
+        </w:rPr>
         <w:t xml:space="preserve">    private final int port;</w:t>
       </w:r>
     </w:p>
@@ -2790,6 +2947,19 @@
           <w:rFonts w:ascii="Courier New" w:hAnsi="Courier New"/>
           <w:sz w:val="19"/>
         </w:rPr>
+        <w:t xml:space="preserve">    /** Source of unique user IDs; thread-safe, and IDs are never reused. */</w:t>
+      </w:r>
+    </w:p>
+    <w:p>
+      <w:pPr>
+        <w:spacing w:line="240" w:lineRule="auto" w:after="0"/>
+        <w:ind w:left="432"/>
+      </w:pPr>
+      <w:r>
+        <w:rPr>
+          <w:rFonts w:ascii="Courier New" w:hAnsi="Courier New"/>
+          <w:sz w:val="19"/>
+        </w:rPr>
         <w:t xml:space="preserve">    private final AtomicInteger nextUserId = new AtomicInteger(1);</w:t>
       </w:r>
     </w:p>
@@ -2803,6 +2973,19 @@
           <w:rFonts w:ascii="Courier New" w:hAnsi="Courier New"/>
           <w:sz w:val="19"/>
         </w:rPr>
+        <w:t xml:space="preserve">    /** Everyone who is online, keyed by user ID; safe to use from many threads. */</w:t>
+      </w:r>
+    </w:p>
+    <w:p>
+      <w:pPr>
+        <w:spacing w:line="240" w:lineRule="auto" w:after="0"/>
+        <w:ind w:left="432"/>
+      </w:pPr>
+      <w:r>
+        <w:rPr>
+          <w:rFonts w:ascii="Courier New" w:hAnsi="Courier New"/>
+          <w:sz w:val="19"/>
+        </w:rPr>
         <w:t xml:space="preserve">    private final Map&lt;Integer, ClientHandler&gt; connectedUsers = new ConcurrentHashMap&lt;&gt;();</w:t>
       </w:r>
     </w:p>
@@ -2816,6 +2999,19 @@
           <w:rFonts w:ascii="Courier New" w:hAnsi="Courier New"/>
           <w:sz w:val="19"/>
         </w:rPr>
+        <w:t xml:space="preserve">    /** Thread pool that runs one ClientHandler per connected client. */</w:t>
+      </w:r>
+    </w:p>
+    <w:p>
+      <w:pPr>
+        <w:spacing w:line="240" w:lineRule="auto" w:after="0"/>
+        <w:ind w:left="432"/>
+      </w:pPr>
+      <w:r>
+        <w:rPr>
+          <w:rFonts w:ascii="Courier New" w:hAnsi="Courier New"/>
+          <w:sz w:val="19"/>
+        </w:rPr>
         <w:t xml:space="preserve">    private final ExecutorService clientThreads = Executors.newCachedThreadPool();</w:t>
       </w:r>
     </w:p>
@@ -2829,6 +3025,19 @@
           <w:rFonts w:ascii="Courier New" w:hAnsi="Courier New"/>
           <w:sz w:val="19"/>
         </w:rPr>
+        <w:t xml:space="preserve">    /** The listening socket, created by {@link #open()}. */</w:t>
+      </w:r>
+    </w:p>
+    <w:p>
+      <w:pPr>
+        <w:spacing w:line="240" w:lineRule="auto" w:after="0"/>
+        <w:ind w:left="432"/>
+      </w:pPr>
+      <w:r>
+        <w:rPr>
+          <w:rFonts w:ascii="Courier New" w:hAnsi="Courier New"/>
+          <w:sz w:val="19"/>
+        </w:rPr>
         <w:t xml:space="preserve">    private ServerSocket serverSocket;</w:t>
       </w:r>
     </w:p>
@@ -2842,6 +3051,19 @@
           <w:rFonts w:ascii="Courier New" w:hAnsi="Courier New"/>
           <w:sz w:val="19"/>
         </w:rPr>
+        <w:t xml:space="preserve">    /** True while the server accepts clients; volatile so stop() is seen by serve(). */</w:t>
+      </w:r>
+    </w:p>
+    <w:p>
+      <w:pPr>
+        <w:spacing w:line="240" w:lineRule="auto" w:after="0"/>
+        <w:ind w:left="432"/>
+      </w:pPr>
+      <w:r>
+        <w:rPr>
+          <w:rFonts w:ascii="Courier New" w:hAnsi="Courier New"/>
+          <w:sz w:val="19"/>
+        </w:rPr>
         <w:t xml:space="preserve">    private volatile boolean running;</w:t>
       </w:r>
     </w:p>
@@ -4012,7 +4234,7 @@
           <w:rFonts w:ascii="Courier New" w:hAnsi="Courier New"/>
           <w:sz w:val="19"/>
         </w:rPr>
-        <w:t xml:space="preserve">                .sorted((a, b) -&gt; Integer.compare(a.getUserId(), b.getUserId()))</w:t>
+        <w:t xml:space="preserve">                .sorted(Comparator.comparingInt(ClientHandler::getUserId))</w:t>
       </w:r>
     </w:p>
     <w:p>
@@ -5006,6 +5228,19 @@
           <w:rFonts w:ascii="Courier New" w:hAnsi="Courier New"/>
           <w:sz w:val="19"/>
         </w:rPr>
+        <w:t>import java.util.List;</w:t>
+      </w:r>
+    </w:p>
+    <w:p>
+      <w:pPr>
+        <w:spacing w:line="240" w:lineRule="auto" w:after="0"/>
+        <w:ind w:left="432"/>
+      </w:pPr>
+      <w:r>
+        <w:rPr>
+          <w:rFonts w:ascii="Courier New" w:hAnsi="Courier New"/>
+          <w:sz w:val="19"/>
+        </w:rPr>
         <w:t xml:space="preserve"> </w:t>
       </w:r>
     </w:p>
@@ -5214,6 +5449,19 @@
           <w:rFonts w:ascii="Courier New" w:hAnsi="Courier New"/>
           <w:sz w:val="19"/>
         </w:rPr>
+        <w:t xml:space="preserve">    /** The list of commands shown by /help and after joining. */</w:t>
+      </w:r>
+    </w:p>
+    <w:p>
+      <w:pPr>
+        <w:spacing w:line="240" w:lineRule="auto" w:after="0"/>
+        <w:ind w:left="432"/>
+      </w:pPr>
+      <w:r>
+        <w:rPr>
+          <w:rFonts w:ascii="Courier New" w:hAnsi="Courier New"/>
+          <w:sz w:val="19"/>
+        </w:rPr>
         <w:t xml:space="preserve">    private static final String HELP =</w:t>
       </w:r>
     </w:p>
@@ -5253,6 +5501,19 @@
           <w:rFonts w:ascii="Courier New" w:hAnsi="Courier New"/>
           <w:sz w:val="19"/>
         </w:rPr>
+        <w:t xml:space="preserve">    /** The server that owns this client. */</w:t>
+      </w:r>
+    </w:p>
+    <w:p>
+      <w:pPr>
+        <w:spacing w:line="240" w:lineRule="auto" w:after="0"/>
+        <w:ind w:left="432"/>
+      </w:pPr>
+      <w:r>
+        <w:rPr>
+          <w:rFonts w:ascii="Courier New" w:hAnsi="Courier New"/>
+          <w:sz w:val="19"/>
+        </w:rPr>
         <w:t xml:space="preserve">    private final ChatServer server;</w:t>
       </w:r>
     </w:p>
@@ -5266,6 +5527,19 @@
           <w:rFonts w:ascii="Courier New" w:hAnsi="Courier New"/>
           <w:sz w:val="19"/>
         </w:rPr>
+        <w:t xml:space="preserve">    /** The connection to this client. */</w:t>
+      </w:r>
+    </w:p>
+    <w:p>
+      <w:pPr>
+        <w:spacing w:line="240" w:lineRule="auto" w:after="0"/>
+        <w:ind w:left="432"/>
+      </w:pPr>
+      <w:r>
+        <w:rPr>
+          <w:rFonts w:ascii="Courier New" w:hAnsi="Courier New"/>
+          <w:sz w:val="19"/>
+        </w:rPr>
         <w:t xml:space="preserve">    private final Socket socket;</w:t>
       </w:r>
     </w:p>
@@ -5279,6 +5553,19 @@
           <w:rFonts w:ascii="Courier New" w:hAnsi="Courier New"/>
           <w:sz w:val="19"/>
         </w:rPr>
+        <w:t xml:space="preserve">    /** Unique ID assigned by the server. */</w:t>
+      </w:r>
+    </w:p>
+    <w:p>
+      <w:pPr>
+        <w:spacing w:line="240" w:lineRule="auto" w:after="0"/>
+        <w:ind w:left="432"/>
+      </w:pPr>
+      <w:r>
+        <w:rPr>
+          <w:rFonts w:ascii="Courier New" w:hAnsi="Courier New"/>
+          <w:sz w:val="19"/>
+        </w:rPr>
         <w:t xml:space="preserve">    private final int userId;</w:t>
       </w:r>
     </w:p>
@@ -5292,6 +5579,19 @@
           <w:rFonts w:ascii="Courier New" w:hAnsi="Courier New"/>
           <w:sz w:val="19"/>
         </w:rPr>
+        <w:t xml:space="preserve">    /** Text output to this client; created when the handler starts running. */</w:t>
+      </w:r>
+    </w:p>
+    <w:p>
+      <w:pPr>
+        <w:spacing w:line="240" w:lineRule="auto" w:after="0"/>
+        <w:ind w:left="432"/>
+      </w:pPr>
+      <w:r>
+        <w:rPr>
+          <w:rFonts w:ascii="Courier New" w:hAnsi="Courier New"/>
+          <w:sz w:val="19"/>
+        </w:rPr>
         <w:t xml:space="preserve">    private PrintWriter out;</w:t>
       </w:r>
     </w:p>
@@ -5305,6 +5605,19 @@
           <w:rFonts w:ascii="Courier New" w:hAnsi="Courier New"/>
           <w:sz w:val="19"/>
         </w:rPr>
+        <w:t xml:space="preserve">    /** The name the user chose, after cleaning. */</w:t>
+      </w:r>
+    </w:p>
+    <w:p>
+      <w:pPr>
+        <w:spacing w:line="240" w:lineRule="auto" w:after="0"/>
+        <w:ind w:left="432"/>
+      </w:pPr>
+      <w:r>
+        <w:rPr>
+          <w:rFonts w:ascii="Courier New" w:hAnsi="Courier New"/>
+          <w:sz w:val="19"/>
+        </w:rPr>
         <w:t xml:space="preserve">    private String name;</w:t>
       </w:r>
     </w:p>
@@ -6111,20 +6424,20 @@
           <w:rFonts w:ascii="Courier New" w:hAnsi="Courier New"/>
           <w:sz w:val="19"/>
         </w:rPr>
-        <w:t xml:space="preserve">                send("Users online (" + server.getUserList().size() + "): "</w:t>
-      </w:r>
-    </w:p>
-    <w:p>
-      <w:pPr>
-        <w:spacing w:line="240" w:lineRule="auto" w:after="0"/>
-        <w:ind w:left="432"/>
-      </w:pPr>
-      <w:r>
-        <w:rPr>
-          <w:rFonts w:ascii="Courier New" w:hAnsi="Courier New"/>
-          <w:sz w:val="19"/>
-        </w:rPr>
-        <w:t xml:space="preserve">                        + String.join(", ", server.getUserList()));</w:t>
+        <w:t xml:space="preserve">                List&lt;String&gt; users = server.getUserList();</w:t>
+      </w:r>
+    </w:p>
+    <w:p>
+      <w:pPr>
+        <w:spacing w:line="240" w:lineRule="auto" w:after="0"/>
+        <w:ind w:left="432"/>
+      </w:pPr>
+      <w:r>
+        <w:rPr>
+          <w:rFonts w:ascii="Courier New" w:hAnsi="Courier New"/>
+          <w:sz w:val="19"/>
+        </w:rPr>
+        <w:t xml:space="preserve">                send("Users online (" + users.size() + "): " + String.join(", ", users));</w:t>
       </w:r>
     </w:p>
     <w:p>
@@ -7560,6 +7873,19 @@
           <w:rFonts w:ascii="Courier New" w:hAnsi="Courier New"/>
           <w:sz w:val="19"/>
         </w:rPr>
+        <w:t xml:space="preserve">    /** Host name or IP address of the server. */</w:t>
+      </w:r>
+    </w:p>
+    <w:p>
+      <w:pPr>
+        <w:spacing w:line="240" w:lineRule="auto" w:after="0"/>
+        <w:ind w:left="432"/>
+      </w:pPr>
+      <w:r>
+        <w:rPr>
+          <w:rFonts w:ascii="Courier New" w:hAnsi="Courier New"/>
+          <w:sz w:val="19"/>
+        </w:rPr>
         <w:t xml:space="preserve">    private final String host;</w:t>
       </w:r>
     </w:p>
@@ -7573,6 +7899,19 @@
           <w:rFonts w:ascii="Courier New" w:hAnsi="Courier New"/>
           <w:sz w:val="19"/>
         </w:rPr>
+        <w:t xml:space="preserve">    /** Port the server listens on. */</w:t>
+      </w:r>
+    </w:p>
+    <w:p>
+      <w:pPr>
+        <w:spacing w:line="240" w:lineRule="auto" w:after="0"/>
+        <w:ind w:left="432"/>
+      </w:pPr>
+      <w:r>
+        <w:rPr>
+          <w:rFonts w:ascii="Courier New" w:hAnsi="Courier New"/>
+          <w:sz w:val="19"/>
+        </w:rPr>
         <w:t xml:space="preserve">    private final int port;</w:t>
       </w:r>
     </w:p>
@@ -7586,6 +7925,19 @@
           <w:rFonts w:ascii="Courier New" w:hAnsi="Courier New"/>
           <w:sz w:val="19"/>
         </w:rPr>
+        <w:t xml:space="preserve">    /** Where the user's typing is read from. */</w:t>
+      </w:r>
+    </w:p>
+    <w:p>
+      <w:pPr>
+        <w:spacing w:line="240" w:lineRule="auto" w:after="0"/>
+        <w:ind w:left="432"/>
+      </w:pPr>
+      <w:r>
+        <w:rPr>
+          <w:rFonts w:ascii="Courier New" w:hAnsi="Courier New"/>
+          <w:sz w:val="19"/>
+        </w:rPr>
         <w:t xml:space="preserve">    private final BufferedReader keyboard;</w:t>
       </w:r>
     </w:p>
@@ -7599,7 +7951,33 @@
           <w:rFonts w:ascii="Courier New" w:hAnsi="Courier New"/>
           <w:sz w:val="19"/>
         </w:rPr>
+        <w:t xml:space="preserve">    /** Where messages are displayed. */</w:t>
+      </w:r>
+    </w:p>
+    <w:p>
+      <w:pPr>
+        <w:spacing w:line="240" w:lineRule="auto" w:after="0"/>
+        <w:ind w:left="432"/>
+      </w:pPr>
+      <w:r>
+        <w:rPr>
+          <w:rFonts w:ascii="Courier New" w:hAnsi="Courier New"/>
+          <w:sz w:val="19"/>
+        </w:rPr>
         <w:t xml:space="preserve">    private final PrintStream screen;</w:t>
+      </w:r>
+    </w:p>
+    <w:p>
+      <w:pPr>
+        <w:spacing w:line="240" w:lineRule="auto" w:after="0"/>
+        <w:ind w:left="432"/>
+      </w:pPr>
+      <w:r>
+        <w:rPr>
+          <w:rFonts w:ascii="Courier New" w:hAnsi="Courier New"/>
+          <w:sz w:val="19"/>
+        </w:rPr>
+        <w:t xml:space="preserve">    /** Set when the user types /quit, so a closed connection is not reported as an error. */</w:t>
       </w:r>
     </w:p>
     <w:p>
@@ -9178,6 +9556,19 @@
           <w:rFonts w:ascii="Courier New" w:hAnsi="Courier New"/>
           <w:sz w:val="19"/>
         </w:rPr>
+        <w:t xml:space="preserve">    /** How long a test client waits for an expected line before the check fails. */</w:t>
+      </w:r>
+    </w:p>
+    <w:p>
+      <w:pPr>
+        <w:spacing w:line="240" w:lineRule="auto" w:after="0"/>
+        <w:ind w:left="432"/>
+      </w:pPr>
+      <w:r>
+        <w:rPr>
+          <w:rFonts w:ascii="Courier New" w:hAnsi="Courier New"/>
+          <w:sz w:val="19"/>
+        </w:rPr>
         <w:t xml:space="preserve">    private static final int TIMEOUT_MS = 3000;</w:t>
       </w:r>
     </w:p>
@@ -9191,6 +9582,32 @@
           <w:rFonts w:ascii="Courier New" w:hAnsi="Courier New"/>
           <w:sz w:val="19"/>
         </w:rPr>
+        <w:t xml:space="preserve"> </w:t>
+      </w:r>
+    </w:p>
+    <w:p>
+      <w:pPr>
+        <w:spacing w:line="240" w:lineRule="auto" w:after="0"/>
+        <w:ind w:left="432"/>
+      </w:pPr>
+      <w:r>
+        <w:rPr>
+          <w:rFonts w:ascii="Courier New" w:hAnsi="Courier New"/>
+          <w:sz w:val="19"/>
+        </w:rPr>
+        <w:t xml:space="preserve">    /** Number of checks that passed. */</w:t>
+      </w:r>
+    </w:p>
+    <w:p>
+      <w:pPr>
+        <w:spacing w:line="240" w:lineRule="auto" w:after="0"/>
+        <w:ind w:left="432"/>
+      </w:pPr>
+      <w:r>
+        <w:rPr>
+          <w:rFonts w:ascii="Courier New" w:hAnsi="Courier New"/>
+          <w:sz w:val="19"/>
+        </w:rPr>
         <w:t xml:space="preserve">    private static int passed;</w:t>
       </w:r>
     </w:p>
@@ -9204,6 +9621,32 @@
           <w:rFonts w:ascii="Courier New" w:hAnsi="Courier New"/>
           <w:sz w:val="19"/>
         </w:rPr>
+        <w:t xml:space="preserve"> </w:t>
+      </w:r>
+    </w:p>
+    <w:p>
+      <w:pPr>
+        <w:spacing w:line="240" w:lineRule="auto" w:after="0"/>
+        <w:ind w:left="432"/>
+      </w:pPr>
+      <w:r>
+        <w:rPr>
+          <w:rFonts w:ascii="Courier New" w:hAnsi="Courier New"/>
+          <w:sz w:val="19"/>
+        </w:rPr>
+        <w:t xml:space="preserve">    /** Number of checks that failed. */</w:t>
+      </w:r>
+    </w:p>
+    <w:p>
+      <w:pPr>
+        <w:spacing w:line="240" w:lineRule="auto" w:after="0"/>
+        <w:ind w:left="432"/>
+      </w:pPr>
+      <w:r>
+        <w:rPr>
+          <w:rFonts w:ascii="Courier New" w:hAnsi="Courier New"/>
+          <w:sz w:val="19"/>
+        </w:rPr>
         <w:t xml:space="preserve">    private static int failed;</w:t>
       </w:r>
     </w:p>
@@ -9230,6 +9673,58 @@
           <w:rFonts w:ascii="Courier New" w:hAnsi="Courier New"/>
           <w:sz w:val="19"/>
         </w:rPr>
+        <w:t xml:space="preserve">    /** Utility class: not meant to be instantiated. */</w:t>
+      </w:r>
+    </w:p>
+    <w:p>
+      <w:pPr>
+        <w:spacing w:line="240" w:lineRule="auto" w:after="0"/>
+        <w:ind w:left="432"/>
+      </w:pPr>
+      <w:r>
+        <w:rPr>
+          <w:rFonts w:ascii="Courier New" w:hAnsi="Courier New"/>
+          <w:sz w:val="19"/>
+        </w:rPr>
+        <w:t xml:space="preserve">    private ChatTest() {</w:t>
+      </w:r>
+    </w:p>
+    <w:p>
+      <w:pPr>
+        <w:spacing w:line="240" w:lineRule="auto" w:after="0"/>
+        <w:ind w:left="432"/>
+      </w:pPr>
+      <w:r>
+        <w:rPr>
+          <w:rFonts w:ascii="Courier New" w:hAnsi="Courier New"/>
+          <w:sz w:val="19"/>
+        </w:rPr>
+        <w:t xml:space="preserve">    }</w:t>
+      </w:r>
+    </w:p>
+    <w:p>
+      <w:pPr>
+        <w:spacing w:line="240" w:lineRule="auto" w:after="0"/>
+        <w:ind w:left="432"/>
+      </w:pPr>
+      <w:r>
+        <w:rPr>
+          <w:rFonts w:ascii="Courier New" w:hAnsi="Courier New"/>
+          <w:sz w:val="19"/>
+        </w:rPr>
+        <w:t xml:space="preserve"> </w:t>
+      </w:r>
+    </w:p>
+    <w:p>
+      <w:pPr>
+        <w:spacing w:line="240" w:lineRule="auto" w:after="0"/>
+        <w:ind w:left="432"/>
+      </w:pPr>
+      <w:r>
+        <w:rPr>
+          <w:rFonts w:ascii="Courier New" w:hAnsi="Courier New"/>
+          <w:sz w:val="19"/>
+        </w:rPr>
         <w:t xml:space="preserve">    /**</w:t>
       </w:r>
     </w:p>
@@ -9282,6 +9777,19 @@
           <w:rFonts w:ascii="Courier New" w:hAnsi="Courier New"/>
           <w:sz w:val="19"/>
         </w:rPr>
+        <w:t xml:space="preserve">        /** The connection to the server. */</w:t>
+      </w:r>
+    </w:p>
+    <w:p>
+      <w:pPr>
+        <w:spacing w:line="240" w:lineRule="auto" w:after="0"/>
+        <w:ind w:left="432"/>
+      </w:pPr>
+      <w:r>
+        <w:rPr>
+          <w:rFonts w:ascii="Courier New" w:hAnsi="Courier New"/>
+          <w:sz w:val="19"/>
+        </w:rPr>
         <w:t xml:space="preserve">        private final Socket socket;</w:t>
       </w:r>
     </w:p>
@@ -9295,6 +9803,32 @@
           <w:rFonts w:ascii="Courier New" w:hAnsi="Courier New"/>
           <w:sz w:val="19"/>
         </w:rPr>
+        <w:t xml:space="preserve"> </w:t>
+      </w:r>
+    </w:p>
+    <w:p>
+      <w:pPr>
+        <w:spacing w:line="240" w:lineRule="auto" w:after="0"/>
+        <w:ind w:left="432"/>
+      </w:pPr>
+      <w:r>
+        <w:rPr>
+          <w:rFonts w:ascii="Courier New" w:hAnsi="Courier New"/>
+          <w:sz w:val="19"/>
+        </w:rPr>
+        <w:t xml:space="preserve">        /** Lines coming from the server. */</w:t>
+      </w:r>
+    </w:p>
+    <w:p>
+      <w:pPr>
+        <w:spacing w:line="240" w:lineRule="auto" w:after="0"/>
+        <w:ind w:left="432"/>
+      </w:pPr>
+      <w:r>
+        <w:rPr>
+          <w:rFonts w:ascii="Courier New" w:hAnsi="Courier New"/>
+          <w:sz w:val="19"/>
+        </w:rPr>
         <w:t xml:space="preserve">        private final BufferedReader in;</w:t>
       </w:r>
     </w:p>
@@ -9308,6 +9842,32 @@
           <w:rFonts w:ascii="Courier New" w:hAnsi="Courier New"/>
           <w:sz w:val="19"/>
         </w:rPr>
+        <w:t xml:space="preserve"> </w:t>
+      </w:r>
+    </w:p>
+    <w:p>
+      <w:pPr>
+        <w:spacing w:line="240" w:lineRule="auto" w:after="0"/>
+        <w:ind w:left="432"/>
+      </w:pPr>
+      <w:r>
+        <w:rPr>
+          <w:rFonts w:ascii="Courier New" w:hAnsi="Courier New"/>
+          <w:sz w:val="19"/>
+        </w:rPr>
+        <w:t xml:space="preserve">        /** Lines going to the server. */</w:t>
+      </w:r>
+    </w:p>
+    <w:p>
+      <w:pPr>
+        <w:spacing w:line="240" w:lineRule="auto" w:after="0"/>
+        <w:ind w:left="432"/>
+      </w:pPr>
+      <w:r>
+        <w:rPr>
+          <w:rFonts w:ascii="Courier New" w:hAnsi="Courier New"/>
+          <w:sz w:val="19"/>
+        </w:rPr>
         <w:t xml:space="preserve">        private final PrintWriter out;</w:t>
       </w:r>
     </w:p>
@@ -9334,6 +9894,84 @@
           <w:rFonts w:ascii="Courier New" w:hAnsi="Courier New"/>
           <w:sz w:val="19"/>
         </w:rPr>
+        <w:t xml:space="preserve">        /**</w:t>
+      </w:r>
+    </w:p>
+    <w:p>
+      <w:pPr>
+        <w:spacing w:line="240" w:lineRule="auto" w:after="0"/>
+        <w:ind w:left="432"/>
+      </w:pPr>
+      <w:r>
+        <w:rPr>
+          <w:rFonts w:ascii="Courier New" w:hAnsi="Courier New"/>
+          <w:sz w:val="19"/>
+        </w:rPr>
+        <w:t xml:space="preserve">         * Connects to the server on this computer.</w:t>
+      </w:r>
+    </w:p>
+    <w:p>
+      <w:pPr>
+        <w:spacing w:line="240" w:lineRule="auto" w:after="0"/>
+        <w:ind w:left="432"/>
+      </w:pPr>
+      <w:r>
+        <w:rPr>
+          <w:rFonts w:ascii="Courier New" w:hAnsi="Courier New"/>
+          <w:sz w:val="19"/>
+        </w:rPr>
+        <w:t xml:space="preserve">         *</w:t>
+      </w:r>
+    </w:p>
+    <w:p>
+      <w:pPr>
+        <w:spacing w:line="240" w:lineRule="auto" w:after="0"/>
+        <w:ind w:left="432"/>
+      </w:pPr>
+      <w:r>
+        <w:rPr>
+          <w:rFonts w:ascii="Courier New" w:hAnsi="Courier New"/>
+          <w:sz w:val="19"/>
+        </w:rPr>
+        <w:t xml:space="preserve">         * @param port the server's port</w:t>
+      </w:r>
+    </w:p>
+    <w:p>
+      <w:pPr>
+        <w:spacing w:line="240" w:lineRule="auto" w:after="0"/>
+        <w:ind w:left="432"/>
+      </w:pPr>
+      <w:r>
+        <w:rPr>
+          <w:rFonts w:ascii="Courier New" w:hAnsi="Courier New"/>
+          <w:sz w:val="19"/>
+        </w:rPr>
+        <w:t xml:space="preserve">         * @throws IOException if the connection fails</w:t>
+      </w:r>
+    </w:p>
+    <w:p>
+      <w:pPr>
+        <w:spacing w:line="240" w:lineRule="auto" w:after="0"/>
+        <w:ind w:left="432"/>
+      </w:pPr>
+      <w:r>
+        <w:rPr>
+          <w:rFonts w:ascii="Courier New" w:hAnsi="Courier New"/>
+          <w:sz w:val="19"/>
+        </w:rPr>
+        <w:t xml:space="preserve">         */</w:t>
+      </w:r>
+    </w:p>
+    <w:p>
+      <w:pPr>
+        <w:spacing w:line="240" w:lineRule="auto" w:after="0"/>
+        <w:ind w:left="432"/>
+      </w:pPr>
+      <w:r>
+        <w:rPr>
+          <w:rFonts w:ascii="Courier New" w:hAnsi="Courier New"/>
+          <w:sz w:val="19"/>
+        </w:rPr>
         <w:t xml:space="preserve">        TestClient(int port) throws IOException {</w:t>
       </w:r>
     </w:p>
@@ -9451,6 +10089,71 @@
           <w:rFonts w:ascii="Courier New" w:hAnsi="Courier New"/>
           <w:sz w:val="19"/>
         </w:rPr>
+        <w:t xml:space="preserve">        /**</w:t>
+      </w:r>
+    </w:p>
+    <w:p>
+      <w:pPr>
+        <w:spacing w:line="240" w:lineRule="auto" w:after="0"/>
+        <w:ind w:left="432"/>
+      </w:pPr>
+      <w:r>
+        <w:rPr>
+          <w:rFonts w:ascii="Courier New" w:hAnsi="Courier New"/>
+          <w:sz w:val="19"/>
+        </w:rPr>
+        <w:t xml:space="preserve">         * Sends one line to the server.</w:t>
+      </w:r>
+    </w:p>
+    <w:p>
+      <w:pPr>
+        <w:spacing w:line="240" w:lineRule="auto" w:after="0"/>
+        <w:ind w:left="432"/>
+      </w:pPr>
+      <w:r>
+        <w:rPr>
+          <w:rFonts w:ascii="Courier New" w:hAnsi="Courier New"/>
+          <w:sz w:val="19"/>
+        </w:rPr>
+        <w:t xml:space="preserve">         *</w:t>
+      </w:r>
+    </w:p>
+    <w:p>
+      <w:pPr>
+        <w:spacing w:line="240" w:lineRule="auto" w:after="0"/>
+        <w:ind w:left="432"/>
+      </w:pPr>
+      <w:r>
+        <w:rPr>
+          <w:rFonts w:ascii="Courier New" w:hAnsi="Courier New"/>
+          <w:sz w:val="19"/>
+        </w:rPr>
+        <w:t xml:space="preserve">         * @param line the text to send</w:t>
+      </w:r>
+    </w:p>
+    <w:p>
+      <w:pPr>
+        <w:spacing w:line="240" w:lineRule="auto" w:after="0"/>
+        <w:ind w:left="432"/>
+      </w:pPr>
+      <w:r>
+        <w:rPr>
+          <w:rFonts w:ascii="Courier New" w:hAnsi="Courier New"/>
+          <w:sz w:val="19"/>
+        </w:rPr>
+        <w:t xml:space="preserve">         */</w:t>
+      </w:r>
+    </w:p>
+    <w:p>
+      <w:pPr>
+        <w:spacing w:line="240" w:lineRule="auto" w:after="0"/>
+        <w:ind w:left="432"/>
+      </w:pPr>
+      <w:r>
+        <w:rPr>
+          <w:rFonts w:ascii="Courier New" w:hAnsi="Courier New"/>
+          <w:sz w:val="19"/>
+        </w:rPr>
         <w:t xml:space="preserve">        void send(String line) {</w:t>
       </w:r>
     </w:p>
@@ -9503,7 +10206,98 @@
           <w:rFonts w:ascii="Courier New" w:hAnsi="Courier New"/>
           <w:sz w:val="19"/>
         </w:rPr>
-        <w:t xml:space="preserve">        /** Reads lines until one contains the text; returns it, or null if none arrives. */</w:t>
+        <w:t xml:space="preserve">        /**</w:t>
+      </w:r>
+    </w:p>
+    <w:p>
+      <w:pPr>
+        <w:spacing w:line="240" w:lineRule="auto" w:after="0"/>
+        <w:ind w:left="432"/>
+      </w:pPr>
+      <w:r>
+        <w:rPr>
+          <w:rFonts w:ascii="Courier New" w:hAnsi="Courier New"/>
+          <w:sz w:val="19"/>
+        </w:rPr>
+        <w:t xml:space="preserve">         * Reads lines from the server until one contains the given text.</w:t>
+      </w:r>
+    </w:p>
+    <w:p>
+      <w:pPr>
+        <w:spacing w:line="240" w:lineRule="auto" w:after="0"/>
+        <w:ind w:left="432"/>
+      </w:pPr>
+      <w:r>
+        <w:rPr>
+          <w:rFonts w:ascii="Courier New" w:hAnsi="Courier New"/>
+          <w:sz w:val="19"/>
+        </w:rPr>
+        <w:t xml:space="preserve">         *</w:t>
+      </w:r>
+    </w:p>
+    <w:p>
+      <w:pPr>
+        <w:spacing w:line="240" w:lineRule="auto" w:after="0"/>
+        <w:ind w:left="432"/>
+      </w:pPr>
+      <w:r>
+        <w:rPr>
+          <w:rFonts w:ascii="Courier New" w:hAnsi="Courier New"/>
+          <w:sz w:val="19"/>
+        </w:rPr>
+        <w:t xml:space="preserve">         * @param text the text to wait for</w:t>
+      </w:r>
+    </w:p>
+    <w:p>
+      <w:pPr>
+        <w:spacing w:line="240" w:lineRule="auto" w:after="0"/>
+        <w:ind w:left="432"/>
+      </w:pPr>
+      <w:r>
+        <w:rPr>
+          <w:rFonts w:ascii="Courier New" w:hAnsi="Courier New"/>
+          <w:sz w:val="19"/>
+        </w:rPr>
+        <w:t xml:space="preserve">         * @return the first line containing the text, or null if the connection closes or</w:t>
+      </w:r>
+    </w:p>
+    <w:p>
+      <w:pPr>
+        <w:spacing w:line="240" w:lineRule="auto" w:after="0"/>
+        <w:ind w:left="432"/>
+      </w:pPr>
+      <w:r>
+        <w:rPr>
+          <w:rFonts w:ascii="Courier New" w:hAnsi="Courier New"/>
+          <w:sz w:val="19"/>
+        </w:rPr>
+        <w:t xml:space="preserve">         *         nothing matching arrives before the timeout</w:t>
+      </w:r>
+    </w:p>
+    <w:p>
+      <w:pPr>
+        <w:spacing w:line="240" w:lineRule="auto" w:after="0"/>
+        <w:ind w:left="432"/>
+      </w:pPr>
+      <w:r>
+        <w:rPr>
+          <w:rFonts w:ascii="Courier New" w:hAnsi="Courier New"/>
+          <w:sz w:val="19"/>
+        </w:rPr>
+        <w:t xml:space="preserve">         * @throws IOException if reading fails for another reason</w:t>
+      </w:r>
+    </w:p>
+    <w:p>
+      <w:pPr>
+        <w:spacing w:line="240" w:lineRule="auto" w:after="0"/>
+        <w:ind w:left="432"/>
+      </w:pPr>
+      <w:r>
+        <w:rPr>
+          <w:rFonts w:ascii="Courier New" w:hAnsi="Courier New"/>
+          <w:sz w:val="19"/>
+        </w:rPr>
+        <w:t xml:space="preserve">         */</w:t>
       </w:r>
     </w:p>
     <w:p>
@@ -9633,7 +10427,7 @@
           <w:rFonts w:ascii="Courier New" w:hAnsi="Courier New"/>
           <w:sz w:val="19"/>
         </w:rPr>
-        <w:t xml:space="preserve">                return null;</w:t>
+        <w:t xml:space="preserve">                // nothing matching arrived in time: fall through and report null</w:t>
       </w:r>
     </w:p>
     <w:p>
@@ -9698,7 +10492,111 @@
           <w:rFonts w:ascii="Courier New" w:hAnsi="Courier New"/>
           <w:sz w:val="19"/>
         </w:rPr>
-        <w:t xml:space="preserve">        /** Connects, reads the welcome line, sends a name, and waits for the greeting. */</w:t>
+        <w:t xml:space="preserve">        /**</w:t>
+      </w:r>
+    </w:p>
+    <w:p>
+      <w:pPr>
+        <w:spacing w:line="240" w:lineRule="auto" w:after="0"/>
+        <w:ind w:left="432"/>
+      </w:pPr>
+      <w:r>
+        <w:rPr>
+          <w:rFonts w:ascii="Courier New" w:hAnsi="Courier New"/>
+          <w:sz w:val="19"/>
+        </w:rPr>
+        <w:t xml:space="preserve">         * Connects, reads the welcome line, sends a name, and waits for the greeting.</w:t>
+      </w:r>
+    </w:p>
+    <w:p>
+      <w:pPr>
+        <w:spacing w:line="240" w:lineRule="auto" w:after="0"/>
+        <w:ind w:left="432"/>
+      </w:pPr>
+      <w:r>
+        <w:rPr>
+          <w:rFonts w:ascii="Courier New" w:hAnsi="Courier New"/>
+          <w:sz w:val="19"/>
+        </w:rPr>
+        <w:t xml:space="preserve">         *</w:t>
+      </w:r>
+    </w:p>
+    <w:p>
+      <w:pPr>
+        <w:spacing w:line="240" w:lineRule="auto" w:after="0"/>
+        <w:ind w:left="432"/>
+      </w:pPr>
+      <w:r>
+        <w:rPr>
+          <w:rFonts w:ascii="Courier New" w:hAnsi="Courier New"/>
+          <w:sz w:val="19"/>
+        </w:rPr>
+        <w:t xml:space="preserve">         * @param port    the server's port</w:t>
+      </w:r>
+    </w:p>
+    <w:p>
+      <w:pPr>
+        <w:spacing w:line="240" w:lineRule="auto" w:after="0"/>
+        <w:ind w:left="432"/>
+      </w:pPr>
+      <w:r>
+        <w:rPr>
+          <w:rFonts w:ascii="Courier New" w:hAnsi="Courier New"/>
+          <w:sz w:val="19"/>
+        </w:rPr>
+        <w:t xml:space="preserve">         * @param name    the name to join with</w:t>
+      </w:r>
+    </w:p>
+    <w:p>
+      <w:pPr>
+        <w:spacing w:line="240" w:lineRule="auto" w:after="0"/>
+        <w:ind w:left="432"/>
+      </w:pPr>
+      <w:r>
+        <w:rPr>
+          <w:rFonts w:ascii="Courier New" w:hAnsi="Courier New"/>
+          <w:sz w:val="19"/>
+        </w:rPr>
+        <w:t xml:space="preserve">         * @param welcome receives the welcome line, so the test can check the user ID</w:t>
+      </w:r>
+    </w:p>
+    <w:p>
+      <w:pPr>
+        <w:spacing w:line="240" w:lineRule="auto" w:after="0"/>
+        <w:ind w:left="432"/>
+      </w:pPr>
+      <w:r>
+        <w:rPr>
+          <w:rFonts w:ascii="Courier New" w:hAnsi="Courier New"/>
+          <w:sz w:val="19"/>
+        </w:rPr>
+        <w:t xml:space="preserve">         * @return the connected client</w:t>
+      </w:r>
+    </w:p>
+    <w:p>
+      <w:pPr>
+        <w:spacing w:line="240" w:lineRule="auto" w:after="0"/>
+        <w:ind w:left="432"/>
+      </w:pPr>
+      <w:r>
+        <w:rPr>
+          <w:rFonts w:ascii="Courier New" w:hAnsi="Courier New"/>
+          <w:sz w:val="19"/>
+        </w:rPr>
+        <w:t xml:space="preserve">         * @throws IOException if the connection fails</w:t>
+      </w:r>
+    </w:p>
+    <w:p>
+      <w:pPr>
+        <w:spacing w:line="240" w:lineRule="auto" w:after="0"/>
+        <w:ind w:left="432"/>
+      </w:pPr>
+      <w:r>
+        <w:rPr>
+          <w:rFonts w:ascii="Courier New" w:hAnsi="Courier New"/>
+          <w:sz w:val="19"/>
+        </w:rPr>
+        <w:t xml:space="preserve">         */</w:t>
       </w:r>
     </w:p>
     <w:p>
@@ -9815,7 +10713,59 @@
           <w:rFonts w:ascii="Courier New" w:hAnsi="Courier New"/>
           <w:sz w:val="19"/>
         </w:rPr>
-        <w:t xml:space="preserve">        /** Drops the connection without /quit, like a crash or a closed window. */</w:t>
+        <w:t xml:space="preserve">        /**</w:t>
+      </w:r>
+    </w:p>
+    <w:p>
+      <w:pPr>
+        <w:spacing w:line="240" w:lineRule="auto" w:after="0"/>
+        <w:ind w:left="432"/>
+      </w:pPr>
+      <w:r>
+        <w:rPr>
+          <w:rFonts w:ascii="Courier New" w:hAnsi="Courier New"/>
+          <w:sz w:val="19"/>
+        </w:rPr>
+        <w:t xml:space="preserve">         * Drops the connection without /quit, like a crash or a closed window.</w:t>
+      </w:r>
+    </w:p>
+    <w:p>
+      <w:pPr>
+        <w:spacing w:line="240" w:lineRule="auto" w:after="0"/>
+        <w:ind w:left="432"/>
+      </w:pPr>
+      <w:r>
+        <w:rPr>
+          <w:rFonts w:ascii="Courier New" w:hAnsi="Courier New"/>
+          <w:sz w:val="19"/>
+        </w:rPr>
+        <w:t xml:space="preserve">         *</w:t>
+      </w:r>
+    </w:p>
+    <w:p>
+      <w:pPr>
+        <w:spacing w:line="240" w:lineRule="auto" w:after="0"/>
+        <w:ind w:left="432"/>
+      </w:pPr>
+      <w:r>
+        <w:rPr>
+          <w:rFonts w:ascii="Courier New" w:hAnsi="Courier New"/>
+          <w:sz w:val="19"/>
+        </w:rPr>
+        <w:t xml:space="preserve">         * @throws IOException if closing fails</w:t>
+      </w:r>
+    </w:p>
+    <w:p>
+      <w:pPr>
+        <w:spacing w:line="240" w:lineRule="auto" w:after="0"/>
+        <w:ind w:left="432"/>
+      </w:pPr>
+      <w:r>
+        <w:rPr>
+          <w:rFonts w:ascii="Courier New" w:hAnsi="Courier New"/>
+          <w:sz w:val="19"/>
+        </w:rPr>
+        <w:t xml:space="preserve">         */</w:t>
       </w:r>
     </w:p>
     <w:p>
@@ -9880,6 +10830,71 @@
           <w:rFonts w:ascii="Courier New" w:hAnsi="Courier New"/>
           <w:sz w:val="19"/>
         </w:rPr>
+        <w:t xml:space="preserve">        /**</w:t>
+      </w:r>
+    </w:p>
+    <w:p>
+      <w:pPr>
+        <w:spacing w:line="240" w:lineRule="auto" w:after="0"/>
+        <w:ind w:left="432"/>
+      </w:pPr>
+      <w:r>
+        <w:rPr>
+          <w:rFonts w:ascii="Courier New" w:hAnsi="Courier New"/>
+          <w:sz w:val="19"/>
+        </w:rPr>
+        <w:t xml:space="preserve">         * Closes the connection when the try-with-resources block ends.</w:t>
+      </w:r>
+    </w:p>
+    <w:p>
+      <w:pPr>
+        <w:spacing w:line="240" w:lineRule="auto" w:after="0"/>
+        <w:ind w:left="432"/>
+      </w:pPr>
+      <w:r>
+        <w:rPr>
+          <w:rFonts w:ascii="Courier New" w:hAnsi="Courier New"/>
+          <w:sz w:val="19"/>
+        </w:rPr>
+        <w:t xml:space="preserve">         *</w:t>
+      </w:r>
+    </w:p>
+    <w:p>
+      <w:pPr>
+        <w:spacing w:line="240" w:lineRule="auto" w:after="0"/>
+        <w:ind w:left="432"/>
+      </w:pPr>
+      <w:r>
+        <w:rPr>
+          <w:rFonts w:ascii="Courier New" w:hAnsi="Courier New"/>
+          <w:sz w:val="19"/>
+        </w:rPr>
+        <w:t xml:space="preserve">         * @throws IOException if closing fails</w:t>
+      </w:r>
+    </w:p>
+    <w:p>
+      <w:pPr>
+        <w:spacing w:line="240" w:lineRule="auto" w:after="0"/>
+        <w:ind w:left="432"/>
+      </w:pPr>
+      <w:r>
+        <w:rPr>
+          <w:rFonts w:ascii="Courier New" w:hAnsi="Courier New"/>
+          <w:sz w:val="19"/>
+        </w:rPr>
+        <w:t xml:space="preserve">         */</w:t>
+      </w:r>
+    </w:p>
+    <w:p>
+      <w:pPr>
+        <w:spacing w:line="240" w:lineRule="auto" w:after="0"/>
+        <w:ind w:left="432"/>
+      </w:pPr>
+      <w:r>
+        <w:rPr>
+          <w:rFonts w:ascii="Courier New" w:hAnsi="Courier New"/>
+          <w:sz w:val="19"/>
+        </w:rPr>
         <w:t xml:space="preserve">        @Override</w:t>
       </w:r>
     </w:p>
@@ -9958,6 +10973,84 @@
           <w:rFonts w:ascii="Courier New" w:hAnsi="Courier New"/>
           <w:sz w:val="19"/>
         </w:rPr>
+        <w:t xml:space="preserve">    /**</w:t>
+      </w:r>
+    </w:p>
+    <w:p>
+      <w:pPr>
+        <w:spacing w:line="240" w:lineRule="auto" w:after="0"/>
+        <w:ind w:left="432"/>
+      </w:pPr>
+      <w:r>
+        <w:rPr>
+          <w:rFonts w:ascii="Courier New" w:hAnsi="Courier New"/>
+          <w:sz w:val="19"/>
+        </w:rPr>
+        <w:t xml:space="preserve">     * Runs every check against a real server and prints the results.</w:t>
+      </w:r>
+    </w:p>
+    <w:p>
+      <w:pPr>
+        <w:spacing w:line="240" w:lineRule="auto" w:after="0"/>
+        <w:ind w:left="432"/>
+      </w:pPr>
+      <w:r>
+        <w:rPr>
+          <w:rFonts w:ascii="Courier New" w:hAnsi="Courier New"/>
+          <w:sz w:val="19"/>
+        </w:rPr>
+        <w:t xml:space="preserve">     *</w:t>
+      </w:r>
+    </w:p>
+    <w:p>
+      <w:pPr>
+        <w:spacing w:line="240" w:lineRule="auto" w:after="0"/>
+        <w:ind w:left="432"/>
+      </w:pPr>
+      <w:r>
+        <w:rPr>
+          <w:rFonts w:ascii="Courier New" w:hAnsi="Courier New"/>
+          <w:sz w:val="19"/>
+        </w:rPr>
+        <w:t xml:space="preserve">     * @param args not used</w:t>
+      </w:r>
+    </w:p>
+    <w:p>
+      <w:pPr>
+        <w:spacing w:line="240" w:lineRule="auto" w:after="0"/>
+        <w:ind w:left="432"/>
+      </w:pPr>
+      <w:r>
+        <w:rPr>
+          <w:rFonts w:ascii="Courier New" w:hAnsi="Courier New"/>
+          <w:sz w:val="19"/>
+        </w:rPr>
+        <w:t xml:space="preserve">     * @throws Exception if the server cannot be started</w:t>
+      </w:r>
+    </w:p>
+    <w:p>
+      <w:pPr>
+        <w:spacing w:line="240" w:lineRule="auto" w:after="0"/>
+        <w:ind w:left="432"/>
+      </w:pPr>
+      <w:r>
+        <w:rPr>
+          <w:rFonts w:ascii="Courier New" w:hAnsi="Courier New"/>
+          <w:sz w:val="19"/>
+        </w:rPr>
+        <w:t xml:space="preserve">     */</w:t>
+      </w:r>
+    </w:p>
+    <w:p>
+      <w:pPr>
+        <w:spacing w:line="240" w:lineRule="auto" w:after="0"/>
+        <w:ind w:left="432"/>
+      </w:pPr>
+      <w:r>
+        <w:rPr>
+          <w:rFonts w:ascii="Courier New" w:hAnsi="Courier New"/>
+          <w:sz w:val="19"/>
+        </w:rPr>
         <w:t xml:space="preserve">    public static void main(String[] args) throws Exception {</w:t>
       </w:r>
     </w:p>
@@ -11050,7 +12143,98 @@
           <w:rFonts w:ascii="Courier New" w:hAnsi="Courier New"/>
           <w:sz w:val="19"/>
         </w:rPr>
-        <w:t xml:space="preserve">    /** Runs the real ChatClient class with scripted keyboard input. */</w:t>
+        <w:t xml:space="preserve">    /**</w:t>
+      </w:r>
+    </w:p>
+    <w:p>
+      <w:pPr>
+        <w:spacing w:line="240" w:lineRule="auto" w:after="0"/>
+        <w:ind w:left="432"/>
+      </w:pPr>
+      <w:r>
+        <w:rPr>
+          <w:rFonts w:ascii="Courier New" w:hAnsi="Courier New"/>
+          <w:sz w:val="19"/>
+        </w:rPr>
+        <w:t xml:space="preserve">     * Runs the real ChatClient class with scripted keyboard input.</w:t>
+      </w:r>
+    </w:p>
+    <w:p>
+      <w:pPr>
+        <w:spacing w:line="240" w:lineRule="auto" w:after="0"/>
+        <w:ind w:left="432"/>
+      </w:pPr>
+      <w:r>
+        <w:rPr>
+          <w:rFonts w:ascii="Courier New" w:hAnsi="Courier New"/>
+          <w:sz w:val="19"/>
+        </w:rPr>
+        <w:t xml:space="preserve">     *</w:t>
+      </w:r>
+    </w:p>
+    <w:p>
+      <w:pPr>
+        <w:spacing w:line="240" w:lineRule="auto" w:after="0"/>
+        <w:ind w:left="432"/>
+      </w:pPr>
+      <w:r>
+        <w:rPr>
+          <w:rFonts w:ascii="Courier New" w:hAnsi="Courier New"/>
+          <w:sz w:val="19"/>
+        </w:rPr>
+        <w:t xml:space="preserve">     * @param console where results are printed</w:t>
+      </w:r>
+    </w:p>
+    <w:p>
+      <w:pPr>
+        <w:spacing w:line="240" w:lineRule="auto" w:after="0"/>
+        <w:ind w:left="432"/>
+      </w:pPr>
+      <w:r>
+        <w:rPr>
+          <w:rFonts w:ascii="Courier New" w:hAnsi="Courier New"/>
+          <w:sz w:val="19"/>
+        </w:rPr>
+        <w:t xml:space="preserve">     * @param port    the running server's port</w:t>
+      </w:r>
+    </w:p>
+    <w:p>
+      <w:pPr>
+        <w:spacing w:line="240" w:lineRule="auto" w:after="0"/>
+        <w:ind w:left="432"/>
+      </w:pPr>
+      <w:r>
+        <w:rPr>
+          <w:rFonts w:ascii="Courier New" w:hAnsi="Courier New"/>
+          <w:sz w:val="19"/>
+        </w:rPr>
+        <w:t xml:space="preserve">     * @param alice   a connected user who should receive the client's message</w:t>
+      </w:r>
+    </w:p>
+    <w:p>
+      <w:pPr>
+        <w:spacing w:line="240" w:lineRule="auto" w:after="0"/>
+        <w:ind w:left="432"/>
+      </w:pPr>
+      <w:r>
+        <w:rPr>
+          <w:rFonts w:ascii="Courier New" w:hAnsi="Courier New"/>
+          <w:sz w:val="19"/>
+        </w:rPr>
+        <w:t xml:space="preserve">     * @throws Exception if the client cannot be run</w:t>
+      </w:r>
+    </w:p>
+    <w:p>
+      <w:pPr>
+        <w:spacing w:line="240" w:lineRule="auto" w:after="0"/>
+        <w:ind w:left="432"/>
+      </w:pPr>
+      <w:r>
+        <w:rPr>
+          <w:rFonts w:ascii="Courier New" w:hAnsi="Courier New"/>
+          <w:sz w:val="19"/>
+        </w:rPr>
+        <w:t xml:space="preserve">     */</w:t>
       </w:r>
     </w:p>
     <w:p>
@@ -11310,7 +12494,85 @@
           <w:rFonts w:ascii="Courier New" w:hAnsi="Courier New"/>
           <w:sz w:val="19"/>
         </w:rPr>
-        <w:t xml:space="preserve">    /** A client started while no server is running must explain the problem, not crash. */</w:t>
+        <w:t xml:space="preserve">    /**</w:t>
+      </w:r>
+    </w:p>
+    <w:p>
+      <w:pPr>
+        <w:spacing w:line="240" w:lineRule="auto" w:after="0"/>
+        <w:ind w:left="432"/>
+      </w:pPr>
+      <w:r>
+        <w:rPr>
+          <w:rFonts w:ascii="Courier New" w:hAnsi="Courier New"/>
+          <w:sz w:val="19"/>
+        </w:rPr>
+        <w:t xml:space="preserve">     * Checks that a client started while no server is running explains the problem instead of</w:t>
+      </w:r>
+    </w:p>
+    <w:p>
+      <w:pPr>
+        <w:spacing w:line="240" w:lineRule="auto" w:after="0"/>
+        <w:ind w:left="432"/>
+      </w:pPr>
+      <w:r>
+        <w:rPr>
+          <w:rFonts w:ascii="Courier New" w:hAnsi="Courier New"/>
+          <w:sz w:val="19"/>
+        </w:rPr>
+        <w:t xml:space="preserve">     * crashing.</w:t>
+      </w:r>
+    </w:p>
+    <w:p>
+      <w:pPr>
+        <w:spacing w:line="240" w:lineRule="auto" w:after="0"/>
+        <w:ind w:left="432"/>
+      </w:pPr>
+      <w:r>
+        <w:rPr>
+          <w:rFonts w:ascii="Courier New" w:hAnsi="Courier New"/>
+          <w:sz w:val="19"/>
+        </w:rPr>
+        <w:t xml:space="preserve">     *</w:t>
+      </w:r>
+    </w:p>
+    <w:p>
+      <w:pPr>
+        <w:spacing w:line="240" w:lineRule="auto" w:after="0"/>
+        <w:ind w:left="432"/>
+      </w:pPr>
+      <w:r>
+        <w:rPr>
+          <w:rFonts w:ascii="Courier New" w:hAnsi="Courier New"/>
+          <w:sz w:val="19"/>
+        </w:rPr>
+        <w:t xml:space="preserve">     * @param console where results are printed</w:t>
+      </w:r>
+    </w:p>
+    <w:p>
+      <w:pPr>
+        <w:spacing w:line="240" w:lineRule="auto" w:after="0"/>
+        <w:ind w:left="432"/>
+      </w:pPr>
+      <w:r>
+        <w:rPr>
+          <w:rFonts w:ascii="Courier New" w:hAnsi="Courier New"/>
+          <w:sz w:val="19"/>
+        </w:rPr>
+        <w:t xml:space="preserve">     * @throws IOException if a free port cannot be found</w:t>
+      </w:r>
+    </w:p>
+    <w:p>
+      <w:pPr>
+        <w:spacing w:line="240" w:lineRule="auto" w:after="0"/>
+        <w:ind w:left="432"/>
+      </w:pPr>
+      <w:r>
+        <w:rPr>
+          <w:rFonts w:ascii="Courier New" w:hAnsi="Courier New"/>
+          <w:sz w:val="19"/>
+        </w:rPr>
+        <w:t xml:space="preserve">     */</w:t>
       </w:r>
     </w:p>
     <w:p>
@@ -11467,6 +12729,97 @@
           <w:sz w:val="19"/>
         </w:rPr>
         <w:t xml:space="preserve"> </w:t>
+      </w:r>
+    </w:p>
+    <w:p>
+      <w:pPr>
+        <w:spacing w:line="240" w:lineRule="auto" w:after="0"/>
+        <w:ind w:left="432"/>
+      </w:pPr>
+      <w:r>
+        <w:rPr>
+          <w:rFonts w:ascii="Courier New" w:hAnsi="Courier New"/>
+          <w:sz w:val="19"/>
+        </w:rPr>
+        <w:t xml:space="preserve">    /**</w:t>
+      </w:r>
+    </w:p>
+    <w:p>
+      <w:pPr>
+        <w:spacing w:line="240" w:lineRule="auto" w:after="0"/>
+        <w:ind w:left="432"/>
+      </w:pPr>
+      <w:r>
+        <w:rPr>
+          <w:rFonts w:ascii="Courier New" w:hAnsi="Courier New"/>
+          <w:sz w:val="19"/>
+        </w:rPr>
+        <w:t xml:space="preserve">     * Records one check and prints PASS or FAIL.</w:t>
+      </w:r>
+    </w:p>
+    <w:p>
+      <w:pPr>
+        <w:spacing w:line="240" w:lineRule="auto" w:after="0"/>
+        <w:ind w:left="432"/>
+      </w:pPr>
+      <w:r>
+        <w:rPr>
+          <w:rFonts w:ascii="Courier New" w:hAnsi="Courier New"/>
+          <w:sz w:val="19"/>
+        </w:rPr>
+        <w:t xml:space="preserve">     *</w:t>
+      </w:r>
+    </w:p>
+    <w:p>
+      <w:pPr>
+        <w:spacing w:line="240" w:lineRule="auto" w:after="0"/>
+        <w:ind w:left="432"/>
+      </w:pPr>
+      <w:r>
+        <w:rPr>
+          <w:rFonts w:ascii="Courier New" w:hAnsi="Courier New"/>
+          <w:sz w:val="19"/>
+        </w:rPr>
+        <w:t xml:space="preserve">     * @param console     where results are printed</w:t>
+      </w:r>
+    </w:p>
+    <w:p>
+      <w:pPr>
+        <w:spacing w:line="240" w:lineRule="auto" w:after="0"/>
+        <w:ind w:left="432"/>
+      </w:pPr>
+      <w:r>
+        <w:rPr>
+          <w:rFonts w:ascii="Courier New" w:hAnsi="Courier New"/>
+          <w:sz w:val="19"/>
+        </w:rPr>
+        <w:t xml:space="preserve">     * @param description what the check verifies</w:t>
+      </w:r>
+    </w:p>
+    <w:p>
+      <w:pPr>
+        <w:spacing w:line="240" w:lineRule="auto" w:after="0"/>
+        <w:ind w:left="432"/>
+      </w:pPr>
+      <w:r>
+        <w:rPr>
+          <w:rFonts w:ascii="Courier New" w:hAnsi="Courier New"/>
+          <w:sz w:val="19"/>
+        </w:rPr>
+        <w:t xml:space="preserve">     * @param condition   true if the check passed</w:t>
+      </w:r>
+    </w:p>
+    <w:p>
+      <w:pPr>
+        <w:spacing w:line="240" w:lineRule="auto" w:after="0"/>
+        <w:ind w:left="432"/>
+      </w:pPr>
+      <w:r>
+        <w:rPr>
+          <w:rFonts w:ascii="Courier New" w:hAnsi="Courier New"/>
+          <w:sz w:val="19"/>
+        </w:rPr>
+        <w:t xml:space="preserve">     */</w:t>
       </w:r>
     </w:p>
     <w:p>

</xml_diff>